<commit_message>
Landing and prijava page edits (owner, 16 Sept evening)
</commit_message>
<xml_diff>
--- a/docs/prijava/prijedlog-projekta.docx
+++ b/docs/prijava/prijedlog-projekta.docx
@@ -577,7 +577,7 @@
           <w:color w:val="0C1250"/>
           <w:sz w:val="22"/>
         </w:rPr>
-        <w:t>, odabire se gradska četvrt i stvarno stajalište, a telefon ili druga kartica preglednika ulazi redovnim jednokratnim kodom. Zaslon bez sesije izmjenjuje tri prizora (Promet, Večeras, Grad), a nakon skeniranja prikazuje sloj koji gleda osoba koja ga vodi. Ne postoji odvojena demonstracija s izmišljenim podacima ili zaobiđenom sesijom.</w:t>
+        <w:t>, odabire se gradska četvrt i stvarno stajalište, a telefon ili druga kartica preglednika ulazi redovnim jednokratnim kodom. Zaslon bez sesije stalno prikazuje kvart: kartu s tramvajskom mrežom oko stajališta i najviše tri rečenice poredane po važnosti, a nakon skeniranja prikazuje sloj koji gleda osoba koja ga vodi. Ne postoji odvojena demonstracija s izmišljenim podacima ili zaobiđenom sesijom.</w:t>
       </w:r>
     </w:p>
     <w:p>
@@ -906,7 +906,7 @@
           <w:color w:val="0C1250"/>
           <w:sz w:val="22"/>
         </w:rPr>
-        <w:t xml:space="preserve">Zaslon bez dodira ima stalan okvir i izmjenjive prizore. Zaglavlje nosi znak Kaj ima?, oznaku stajališta prostora, datum, sat i, kad DHMZ odgovara, vrijeme kao stanje uz sat (glif, temperatura, zalazak sunca), nikad kao pločicu. Desni stupac nosi dvije brojčane pločice (vozila u pokretu na mreži, zatvaranja u blizini stajališta) i pozivnu karticu "Skeniraj za 10 minuta grada." s QR kodom od najmanje 240 piksela, uputom za tipkanje koda i kodom ispisanim u dvije skupine po četiri znaka (ABCD·EFG0) za čitanje naglas ili tipkanje, uz vidljivu traku koja pokazuje koliko je ostalo do sljedećeg koda. Polje je lokalna vektorska karta koja stoji kroz sva tri prizora; prizor mijenja kadar, oznaku u kutu karte i tračnicu pločica uz njezin donji rub, svakih 20 sekundi: Promet (kadar na stajalištu prostora: linije stajališta i vozila u blizini na karti, pločice linija s oba kraja linije, riječju stanja i brojem vozila, te traka radova u kvartu), Večeras (kadar na gradskoj četvrti: današnja datirana događanja iz otvorenih izvora za cijeli grad, dok ih ima, a ona s objavljenom koordinatom i na karti) i Grad (isti kadar sa sjedištem četvrti: sljedeća sjednica Gradske skupštine, gradske obavijesti pod Otvorenom dozvolom i najnoviji potres EMSC-a kad ga ima; akti Službenog glasnika razine su sesije i pojavljuju se tek nakon skeniranja). Karta je nacrtana za čitanje s tri metra i nosi točke koje Grad objavljuje: radove u tijeku, najbližu dežurnu ljekarnu, zborna mjesta dok je stanje sigurnosti hitno, najnoviji potres i obris četvrti. Karta, vrijeme i pozivna kartica stoje na mjestu; kod i QR kod mijenjaju se svakih 30 sekundi. Sigurnosna traka uz donji rub u jednom je retku: štit i riječ Sigurnost, presuda riječju (mirno, upozorenje ili nepotvrđeno), izvori DHMZ · EMSC s vremenom potvrde ili aktivno upozorenje, dežurna ljekarna, odbrojavanje do sljedećeg prizora i poveznica na </w:t>
+        <w:t xml:space="preserve">Zaslon bez dodira ima stalan okvir i jedan stalan pogled na kvart. Zaglavlje nosi znak Kaj ima?, oznaku stajališta prostora, datum, sat i, kad DHMZ odgovara, vrijeme kao stanje uz sat (glif, temperatura, zalazak sunca), nikad kao pločicu. Polje je lokalna vektorska karta s jednim nepomičnim kadrom: kamera je namještena tako da po širini polja stane 2,8 km grada oko stajališta prostora, sjever je gore i kadar se ne mijenja. Karta je nacrtana za čitanje s tri metra: dva tona namjene prostora, ulice kao vlasi bez obruba, najviše osam imena glavnih ulica, imena kvartova kao najveće riječi na tlu i nijedna točka interesa. Figura na toj podlozi su tramvajske tračnice i vozila: linije koje staju na stajalištu prostora, vozila s brojem linije (tramvaj kao pločica, autobus kao kapsula), stajališta samo na linijama toga zaslona, a stajalište prostora s prstenom i vlastitim imenom. Karta nosi i točke koje Grad objavljuje: radove u tijeku, najbližu dežurnu ljekarnu, zborna mjesta dok je stanje sigurnosti hitno, najnoviji potres i obris četvrti; navod izvora karte stoji uz njezin donji desni rub. Desni stupac nosi najviše tri rečenice o kvartu, poredane po važnosti, u gramatici natpis · vrijednost · kontekst: promet na stajalištu (linije, najveće kašnjenje ili "Sve linije voze redovito", broj vozila u blizini i vrijeme podatka ZET-a), potres magnitude 3 i veće u zadnja 24 sata u krugu od 150 km, zatvorena ulica u blizini, zadnji polasci sa stajališta nakon 20 sati, obavijest ZET-a, sljedeća sjednica Gradske skupštine, radovi u kvartu i kvartovska obavijest; akti Službenog glasnika razine su sesije i pojavljuju se tek nakon skeniranja. Rečenica koja je već na zaslonu zadržava mjesto dok je nova jasno ne nadmaši, pa se stupac ne mijenja bez razloga, a vrijednost se krati na granici riječi, nikad usred nje. Ispod stupca je pozivna kartica "Skeniraj za 10 minuta grada." s QR kodom od najmanje 240 piksela, uputom za tipkanje koda i kodom ispisanim u dvije skupine po četiri znaka (ABCD·EFG0) za čitanje naglas ili tipkanje, uz vidljivu traku koja pokazuje koliko je ostalo do sljedećeg koda. Karta, vrijeme i pozivna kartica stoje na mjestu; kod i QR kod mijenjaju se svakih 30 sekundi. Sigurnosna traka uz donji rub u jednom je retku: štit i riječ Sigurnost, presuda riječju (mirno, upozorenje ili nepotvrđeno), izvori DHMZ · EMSC s vremenom potvrde ili aktivno upozorenje, dežurna ljekarna i poveznica na </w:t>
       </w:r>
       <w:r>
         <w:rPr>
@@ -921,7 +921,7 @@
           <w:color w:val="0C1250"/>
           <w:sz w:val="22"/>
         </w:rPr>
-        <w:t xml:space="preserve">. Svaki blok nosi vlastiti navod izvora. Dolasci po stajalištu </w:t>
+        <w:t xml:space="preserve">. Svaki blok nosi vlastiti navod izvora. Dolasci po stajalištu u stvarnom vremenu </w:t>
       </w:r>
       <w:r>
         <w:rPr>
@@ -978,7 +978,7 @@
           <w:color w:val="0C1250"/>
           <w:sz w:val="22"/>
         </w:rPr>
-        <w:t>Zaslon s dodirom nosi i "Osnovno": dodir na riječ presude u sigurnosnoj traci otvara važeće upozorenje ako postoji, linije u blizini stajališta, vrijeme, zatvorene prometnice i dežurnu ljekarnu, bez skeniranja, bez sesije i bez odbrojavanja, a nakon devedeset sekundi bez dodira zaslon se vraća na poziv. Gradski zaslon ne smije uskratiti informaciju čovjeku koji nema telefon za skeniranje; skeniranje otključava grad na vlastitom uređaju, a ne oduzima ga zaslonu pred kojim čovjek stoji. Tema je tamna nakon zalaska i svijetla danju, prema izračunatim vremenima sunca, uz mogućnost da prostor odabere. Tipografija zaslona ima po kompoziciji devet razina, sve iz jednog skupa tokena: na 1080p kod 84 px (ograničen na 15 % širine svoje kartice), naslovi 40 px, tekst 28 px, navodi izvora 20 px; kompozicija za 1366 × 768 i za okomiti totem 1080 × 1920 zasebno je nacrtana, ne proporcionalno smanjena. Nakon skeniranja zaslon prikazuje sloj koji gleda osoba koja ga vodi, u rasporedu za gledanje s udaljenosti, i vraća se pozivu kad sesija istekne. Izmjena prizora staje uz sustavnu postavku smanjenog pokreta i u laganom načinu rada.</w:t>
+        <w:t>Zaslon s dodirom nosi i "Osnovno": dodir na riječ presude u sigurnosnoj traci otvara važeće upozorenje ako postoji, linije u blizini stajališta, vrijeme, zatvorene prometnice i dežurnu ljekarnu, bez skeniranja, bez sesije i bez odbrojavanja, a nakon devedeset sekundi bez dodira zaslon se vraća na poziv. Gradski zaslon ne smije uskratiti informaciju čovjeku koji nema telefon za skeniranje; skeniranje otključava grad na vlastitom uređaju, a ne oduzima ga zaslonu pred kojim čovjek stoji. Tema je tamna nakon zalaska i svijetla danju, prema izračunatim vremenima sunca, uz mogućnost da prostor odabere. Tipografija zaslona ima po kompoziciji devet razina, sve iz jednog skupa tokena: na 1080p kod 84 px (ograničen na 15 % širine svoje kartice), naslovi 40 px, tekst 28 px, navodi izvora 20 px; kompozicija za 1366 × 768 i za okomiti totem 1080 × 1920 zasebno je nacrtana, ne proporcionalno smanjena. Nakon skeniranja zaslon prikazuje sloj koji gleda osoba koja ga vodi, u rasporedu za gledanje s udaljenosti, i vraća se pozivu kad sesija istekne. Pomicanje vozila po karti staje uz sustavnu postavku smanjenog pokreta, a u laganom načinu rada karte nema.</w:t>
       </w:r>
     </w:p>
     <w:p>
@@ -1031,7 +1031,7 @@
           <w:color w:val="4A5178"/>
           <w:sz w:val="18"/>
         </w:rPr>
-        <w:t>Javni zaslon u prostoru: karta stoji kroz sva tri prizora, prizor mijenja kadar i pločice uz donji rub karte, a pozivnica s QR kodom i osmeroslovnim kodom otključava deset minuta grada na telefonu. Prikaz: vozila u pokretu, vrijeme i sigurnost su snimka otvorenih izvora od 15. 9. 2026.; stanja linija, broj vozila, zatvaranja i radovi ilustrativni su.</w:t>
+        <w:t>Javni zaslon u prostoru: jedan nepomičan kadar na kvartu, tramvajske tračnice i vozila kao figura, najviše tri rečenice poredane po važnosti, a pozivnica s QR kodom i osmeroslovnim kodom otključava deset minuta grada na telefonu. Prikaz je snimka zaslona u radu 16. 9. 2026. u 19:41, sa živim podacima u tom trenutku.</w:t>
       </w:r>
     </w:p>
     <w:p>
@@ -2768,7 +2768,7 @@
           <w:color w:val="0C1250"/>
           <w:sz w:val="22"/>
         </w:rPr>
-        <w:t xml:space="preserve">Tehnički: jedan Cloudflare Worker sa statičkim datotekama, četiri Durable Object klase sa SQLite pohranom (zaslon, sesija, indeks kodova, brojači), KV za posljednju dobru kopiju svakog izvora, privatni R2 spremnik za kartografske pločice, WebSocket s hibernacijom za zaslone i sesije, HMAC tokeni bez stanja za podatke, MapLibre GL karta s vlastito posluženim otvorenim vektorskim pločicama (Protomaps na podacima OpenStreetMapa). Bez baze korisnika, bez kolačića, bez identifikatora uređaja. Arhitektura je na jednoj stranici u </w:t>
+        <w:t xml:space="preserve">Tehnički: jedan Cloudflare Worker sa statičkim datotekama, pet Durable Object klasa sa SQLite pohranom (zaslon, sesija, indeks kodova, brojači i jedini promatrač ZET-ova izvora u stvarnom vremenu), KV za posljednju dobru kopiju svakog izvora, privatni R2 spremnik za kartografske pločice, WebSocket s hibernacijom za zaslone i sesije, HMAC tokeni bez stanja za podatke, MapLibre GL karta s vlastito posluženim otvorenim vektorskim pločicama (Protomaps na podacima OpenStreetMapa). Bez baze korisnika, bez kolačića, bez identifikatora uređaja. Arhitektura je na jednoj stranici u </w:t>
       </w:r>
       <w:r>
         <w:rPr>
@@ -2836,7 +2836,7 @@
           <w:color w:val="4A5178"/>
           <w:sz w:val="18"/>
         </w:rPr>
-        <w:t>Jedan Worker, četiri Durable Objecta, bez baze korisnika: tri uređaja govore s jednim Workerom, a podaci dolaze iz otvorenih izvora.</w:t>
+        <w:t>Jedan Worker, Durable Objecti sa SQLite pohranom, bez baze korisnika: tri uređaja govore s jednim Workerom, a podaci dolaze iz otvorenih izvora. Na crtežu su četiri objekta uparivanja i mjerenja; peti, promatrač ZET-ova izvora u stvarnom vremenu, nije prikazan.</w:t>
       </w:r>
     </w:p>
     <w:p>
@@ -3839,7 +3839,7 @@
                 <w:color w:val="0C1250"/>
                 <w:sz w:val="18"/>
               </w:rPr>
-              <w:t>30 s; dnevno</w:t>
+              <w:t>10 s; dnevno</w:t>
             </w:r>
           </w:p>
         </w:tc>
@@ -5719,7 +5719,7 @@
           <w:color w:val="0C1250"/>
           <w:sz w:val="22"/>
         </w:rPr>
-        <w:t xml:space="preserve"> prije roka prijave i javno je dostupan: otvoreni sloj, javni zaslon s rotirajućim kodom koji svatko može postaviti, skeniranje, sesija s istekom i devet modula izvora u šest područja. Primitivi koje projekt koristi rade u produkciji proizvoda koje direktor prijavitelja razvija i vodi: psh.lat (uparivanje uređaja QR kodom i WebSocket na Cloudflare Durable Objects, dvojezično sučelje bez okvira) i kompmajstor.eu (Cloudflare Workers s ograničivačima brzine i brojanjem posjeta bez kolačića, kroz povezano društvo KompMajstor). Oba su javno dostupna i mogu se provjeriti u trenutku ocjenjivanja; izvorni kod psh.lat javan je u cijelosti pod AGPL-3.0-or-later (github.com/matijarma/PushLatte), a za kompmajstor.eu javno je ogledalo izvornog koda bez produkcijskih podataka, za tehnički uvid (github.com/matijarma/KompMajstor.eu).</w:t>
+        <w:t xml:space="preserve"> prije roka prijave i javno je dostupan: otvoreni sloj, javni zaslon s rotirajućim kodom koji svatko može postaviti, skeniranje, sesija s istekom i devet modula izvora u šest područja. Primitivi koje projekt koristi rade u produkciji proizvoda koje direktor prijavitelja razvija i vodi: psh.lat (uparivanje uređaja QR kodom i WebSocket na Cloudflare Durable Objects, dvojezično sučelje bez okvira) i kompmajstor.eu (Cloudflare Workers s ograničivačima brzine i brojanjem posjeta bez kolačića, pod robnom markom KompMajstor u sastavu Aning Filma d.o.o.). Oba su javno dostupna i mogu se provjeriti u trenutku ocjenjivanja; izvorni kod psh.lat javan je u cijelosti pod AGPL-3.0-or-later (github.com/matijarma/PushLatte), a za kompmajstor.eu javno je ogledalo izvornog koda bez produkcijskih podataka, za tehnički uvid (github.com/matijarma/KompMajstor.eu).</w:t>
       </w:r>
     </w:p>
     <w:p>
@@ -5766,7 +5766,7 @@
           <w:color w:val="0C1250"/>
           <w:sz w:val="22"/>
         </w:rPr>
-        <w:t xml:space="preserve">): jedan Worker, četiri Durable Object klase, KV, R2, tri ograničivača brzine, bez baze korisnika. Protokol uparivanja slijedi provjerene obrasce (uzorak OAuth device flow, nasumični jednokratni kodovi u prozorima od 30 s, jednokratne ulaznice, 40 bita entropije), opisan je u </w:t>
+        <w:t xml:space="preserve">): jedan Worker, pet Durable Object klasa, KV, R2, tri ograničivača brzine, bez baze korisnika. Protokol uparivanja slijedi provjerene obrasce (uzorak OAuth device flow, nasumični jednokratni kodovi u prozorima od 30 s, jednokratne ulaznice, 40 bita entropije), opisan je u </w:t>
       </w:r>
       <w:r>
         <w:rPr>
@@ -6692,7 +6692,7 @@
       <w:r>
         <w:drawing>
           <wp:inline xmlns:a="http://schemas.openxmlformats.org/drawingml/2006/main" xmlns:pic="http://schemas.openxmlformats.org/drawingml/2006/picture">
-            <wp:extent cx="5940000" cy="3356301"/>
+            <wp:extent cx="5940000" cy="3351284"/>
             <wp:docPr id="12" name="Picture 12"/>
             <wp:cNvGraphicFramePr>
               <a:graphicFrameLocks noChangeAspect="1"/>
@@ -6713,7 +6713,7 @@
                   <pic:spPr>
                     <a:xfrm>
                       <a:off x="0" y="0"/>
-                      <a:ext cx="5940000" cy="3356301"/>
+                      <a:ext cx="5940000" cy="3351284"/>
                     </a:xfrm>
                     <a:prstGeom prst="rect"/>
                   </pic:spPr>
@@ -9071,7 +9071,7 @@
       <w:r>
         <w:drawing>
           <wp:inline xmlns:a="http://schemas.openxmlformats.org/drawingml/2006/main" xmlns:pic="http://schemas.openxmlformats.org/drawingml/2006/picture">
-            <wp:extent cx="5940000" cy="2588716"/>
+            <wp:extent cx="5940000" cy="2593733"/>
             <wp:docPr id="13" name="Picture 13"/>
             <wp:cNvGraphicFramePr>
               <a:graphicFrameLocks noChangeAspect="1"/>
@@ -9092,7 +9092,7 @@
                   <pic:spPr>
                     <a:xfrm>
                       <a:off x="0" y="0"/>
-                      <a:ext cx="5940000" cy="2588716"/>
+                      <a:ext cx="5940000" cy="2593733"/>
                     </a:xfrm>
                     <a:prstGeom prst="rect"/>
                   </pic:spPr>

</xml_diff>